<commit_message>
Fix deck, model guide, and banner: remove fabricated claims; Gemini 3.5 Flash
Propagates the thesis corrections to the other deliverables. The
"4,078-sequence working subset" (unsupported by anything in the repo)
becomes the full ~100k-sequence corpus with the same 70/15/15 split, and
every claim that the ASL architecture adapts the Squeezeformer design is
replaced with the accurate "custom Conv1D + Transformer hybrid" wording —
including the title baked into the Figure4_3 asset pixels, re-rendered in
matching type. Slide 40's LLM card now reads Gemini 3.5 Flash (was 2.5),
matching the thesis abstract and the deployed configuration.

All three artifacts rebuilt and re-inspected; PPTX notes, guide DOCXs,
and banner text sweep clean of the old claims.

Co-Authored-By: Claude Fable 5 <noreply@anthropic.com>
Claude-Session: https://claude.ai/code/session_01ST3rZR8kpocmUj3HpdmqaB
</commit_message>
<xml_diff>
--- a/thesis/presentation/model_guides/ASL_Model_Complete_Guide.docx
+++ b/thesis/presentation/model_guides/ASL_Model_Complete_Guide.docx
@@ -535,21 +535,12 @@
         <w:pStyle w:val="Heading2"/>
       </w:pPr>
       <w:r>
-        <w:t>2.3 The subset and the split</w:t>
+        <w:t>2.3 The split</w:t>
       </w:r>
     </w:p>
     <w:p>
       <w:r>
-        <w:t xml:space="preserve">The project trained on a working subset of </w:t>
-      </w:r>
-      <w:r>
-        <w:rPr>
-          <w:b/>
-        </w:rPr>
-        <w:t>4,078 sequences</w:t>
-      </w:r>
-      <w:r>
-        <w:t xml:space="preserve">, divided </w:t>
+        <w:t xml:space="preserve">The project trained on the full dataset of roughly 100,000 sequences, divided </w:t>
       </w:r>
       <w:r>
         <w:rPr>
@@ -766,16 +757,16 @@
     </w:p>
     <w:p>
       <w:r>
-        <w:t xml:space="preserve">The architecture is the fixed wiring of the model — the sequence of mathematical operations the input flows through. Ours adapts the </w:t>
+        <w:t xml:space="preserve">The architecture is the fixed wiring of the model — the sequence of mathematical operations the input flows through. Ours is a custom </w:t>
       </w:r>
       <w:r>
         <w:rPr>
           <w:b/>
         </w:rPr>
-        <w:t>Squeezeformer</w:t>
-      </w:r>
-      <w:r>
-        <w:t xml:space="preserve"> design, the family that won the Google ISLR competition. Overall flow: a </w:t>
+        <w:t>convolution-and-transformer hybrid</w:t>
+      </w:r>
+      <w:r>
+        <w:t xml:space="preserve"> designed for this task. Overall flow: a </w:t>
       </w:r>
       <w:r>
         <w:rPr>
@@ -2810,7 +2801,7 @@
               <w:rPr>
                 <w:sz w:val="21"/>
               </w:rPr>
-              <w:t>Google ISLR — ~100k sequences, 250 signs, 21 signers; 4,078-sequence subset</w:t>
+              <w:t>Google ISLR — ~100k sequences, 250 signs, 21 signers (full dataset)</w:t>
             </w:r>
           </w:p>
         </w:tc>

</xml_diff>